<commit_message>
fixes after Skiba review
</commit_message>
<xml_diff>
--- a/docs/notes/Защита ПДП/DOCX/00.ТЛ_ПДП_2026.docx
+++ b/docs/notes/Защита ПДП/DOCX/00.ТЛ_ПДП_2026.docx
@@ -349,7 +349,36 @@
           <w:sz w:val="28"/>
         </w:rPr>
         <w:tab/>
-        <w:t>А.А. Иванов</w:t>
+      </w:r>
+      <w:r>
+        <w:rPr>
+          <w:sz w:val="28"/>
+        </w:rPr>
+        <w:t>И</w:t>
+      </w:r>
+      <w:r>
+        <w:rPr>
+          <w:sz w:val="28"/>
+        </w:rPr>
+        <w:t>.</w:t>
+      </w:r>
+      <w:r>
+        <w:rPr>
+          <w:sz w:val="28"/>
+        </w:rPr>
+        <w:t>В</w:t>
+      </w:r>
+      <w:r>
+        <w:rPr>
+          <w:sz w:val="28"/>
+        </w:rPr>
+        <w:t xml:space="preserve">. </w:t>
+      </w:r>
+      <w:r>
+        <w:rPr>
+          <w:sz w:val="28"/>
+        </w:rPr>
+        <w:t>Зинович</w:t>
       </w:r>
     </w:p>
     <w:p>
@@ -420,7 +449,36 @@
           <w:sz w:val="28"/>
         </w:rPr>
         <w:tab/>
-        <w:t>А.А. Иванов</w:t>
+      </w:r>
+      <w:r>
+        <w:rPr>
+          <w:sz w:val="28"/>
+        </w:rPr>
+        <w:t>И</w:t>
+      </w:r>
+      <w:r>
+        <w:rPr>
+          <w:sz w:val="28"/>
+        </w:rPr>
+        <w:t>.</w:t>
+      </w:r>
+      <w:r>
+        <w:rPr>
+          <w:sz w:val="28"/>
+        </w:rPr>
+        <w:t>Г</w:t>
+      </w:r>
+      <w:r>
+        <w:rPr>
+          <w:sz w:val="28"/>
+        </w:rPr>
+        <w:t xml:space="preserve">. </w:t>
+      </w:r>
+      <w:r>
+        <w:rPr>
+          <w:sz w:val="28"/>
+        </w:rPr>
+        <w:t>Скиба</w:t>
       </w:r>
     </w:p>
     <w:p>
@@ -473,7 +531,36 @@
           <w:sz w:val="28"/>
         </w:rPr>
         <w:tab/>
-        <w:t>А.А. Иванов</w:t>
+      </w:r>
+      <w:r>
+        <w:rPr>
+          <w:sz w:val="28"/>
+        </w:rPr>
+        <w:t>И</w:t>
+      </w:r>
+      <w:r>
+        <w:rPr>
+          <w:sz w:val="28"/>
+        </w:rPr>
+        <w:t>.</w:t>
+      </w:r>
+      <w:r>
+        <w:rPr>
+          <w:sz w:val="28"/>
+        </w:rPr>
+        <w:t>Г</w:t>
+      </w:r>
+      <w:r>
+        <w:rPr>
+          <w:sz w:val="28"/>
+        </w:rPr>
+        <w:t xml:space="preserve">. </w:t>
+      </w:r>
+      <w:r>
+        <w:rPr>
+          <w:sz w:val="28"/>
+        </w:rPr>
+        <w:t>Скиба</w:t>
       </w:r>
     </w:p>
     <w:p>
@@ -550,7 +637,19 @@
         <w:rPr>
           <w:sz w:val="28"/>
         </w:rPr>
-        <w:t>А. Иванов</w:t>
+        <w:t>И</w:t>
+      </w:r>
+      <w:r>
+        <w:rPr>
+          <w:sz w:val="28"/>
+        </w:rPr>
+        <w:t xml:space="preserve">. </w:t>
+      </w:r>
+      <w:r>
+        <w:rPr>
+          <w:sz w:val="28"/>
+        </w:rPr>
+        <w:t>Стракович</w:t>
       </w:r>
     </w:p>
     <w:p>
@@ -1150,7 +1249,7 @@
     <w:lsdException w:name="Unresolved Mention" w:semiHidden="1" w:unhideWhenUsed="1"/>
     <w:lsdException w:name="Smart Link" w:semiHidden="1" w:unhideWhenUsed="1"/>
   </w:latentStyles>
-  <w:style w:type="paragraph" w:default="1" w:styleId="Normal">
+  <w:style w:type="paragraph" w:default="1" w:styleId="a">
     <w:name w:val="Normal"/>
     <w:qFormat/>
     <w:rsid w:val="00B30024"/>
@@ -1165,13 +1264,13 @@
       <w:lang w:eastAsia="ru-RU"/>
     </w:rPr>
   </w:style>
-  <w:style w:type="character" w:default="1" w:styleId="DefaultParagraphFont">
+  <w:style w:type="character" w:default="1" w:styleId="a0">
     <w:name w:val="Default Paragraph Font"/>
     <w:uiPriority w:val="1"/>
     <w:semiHidden/>
     <w:unhideWhenUsed/>
   </w:style>
-  <w:style w:type="table" w:default="1" w:styleId="TableNormal">
+  <w:style w:type="table" w:default="1" w:styleId="a1">
     <w:name w:val="Normal Table"/>
     <w:uiPriority w:val="99"/>
     <w:semiHidden/>
@@ -1186,16 +1285,16 @@
       </w:tblCellMar>
     </w:tblPr>
   </w:style>
-  <w:style w:type="numbering" w:default="1" w:styleId="NoList">
+  <w:style w:type="numbering" w:default="1" w:styleId="a2">
     <w:name w:val="No List"/>
     <w:uiPriority w:val="99"/>
     <w:semiHidden/>
     <w:unhideWhenUsed/>
   </w:style>
-  <w:style w:type="paragraph" w:styleId="Header">
+  <w:style w:type="paragraph" w:styleId="a3">
     <w:name w:val="header"/>
-    <w:basedOn w:val="Normal"/>
-    <w:link w:val="HeaderChar"/>
+    <w:basedOn w:val="a"/>
+    <w:link w:val="a4"/>
     <w:uiPriority w:val="99"/>
     <w:unhideWhenUsed/>
     <w:rsid w:val="00003C9E"/>
@@ -1206,10 +1305,10 @@
       </w:tabs>
     </w:pPr>
   </w:style>
-  <w:style w:type="character" w:customStyle="1" w:styleId="HeaderChar">
-    <w:name w:val="Header Char"/>
-    <w:basedOn w:val="DefaultParagraphFont"/>
-    <w:link w:val="Header"/>
+  <w:style w:type="character" w:customStyle="1" w:styleId="a4">
+    <w:name w:val="Верхний колонтитул Знак"/>
+    <w:basedOn w:val="a0"/>
+    <w:link w:val="a3"/>
     <w:uiPriority w:val="99"/>
     <w:rsid w:val="00003C9E"/>
     <w:rPr>
@@ -1220,10 +1319,10 @@
       <w:lang w:eastAsia="ru-RU"/>
     </w:rPr>
   </w:style>
-  <w:style w:type="paragraph" w:styleId="Footer">
+  <w:style w:type="paragraph" w:styleId="a5">
     <w:name w:val="footer"/>
-    <w:basedOn w:val="Normal"/>
-    <w:link w:val="FooterChar"/>
+    <w:basedOn w:val="a"/>
+    <w:link w:val="a6"/>
     <w:uiPriority w:val="99"/>
     <w:unhideWhenUsed/>
     <w:rsid w:val="00003C9E"/>
@@ -1234,10 +1333,10 @@
       </w:tabs>
     </w:pPr>
   </w:style>
-  <w:style w:type="character" w:customStyle="1" w:styleId="FooterChar">
-    <w:name w:val="Footer Char"/>
-    <w:basedOn w:val="DefaultParagraphFont"/>
-    <w:link w:val="Footer"/>
+  <w:style w:type="character" w:customStyle="1" w:styleId="a6">
+    <w:name w:val="Нижний колонтитул Знак"/>
+    <w:basedOn w:val="a0"/>
+    <w:link w:val="a5"/>
     <w:uiPriority w:val="99"/>
     <w:rsid w:val="00003C9E"/>
     <w:rPr>

</xml_diff>